<commit_message>
Updated a couple of user guide screenshots
</commit_message>
<xml_diff>
--- a/BridgeOpsClient/Documentation/Bridge Manager User Guide.docx
+++ b/BridgeOpsClient/Documentation/Bridge Manager User Guide.docx
@@ -22738,10 +22738,10 @@
           <w:szCs w:val="50"/>
         </w:rPr>
         <w:drawing>
-          <wp:inline distT="0" distB="0" distL="0" distR="0" wp14:anchorId="283B26D6" wp14:editId="3FA69D98">
-            <wp:extent cx="6613200" cy="4006800"/>
-            <wp:effectExtent l="0" t="0" r="0" b="0"/>
-            <wp:docPr id="521152566" name="Picture 4"/>
+          <wp:inline distT="0" distB="0" distL="0" distR="0" wp14:anchorId="6C39678B" wp14:editId="3048CE92">
+            <wp:extent cx="6696000" cy="4053600"/>
+            <wp:effectExtent l="0" t="0" r="0" b="4445"/>
+            <wp:docPr id="1839603980" name="Picture 2"/>
             <wp:cNvGraphicFramePr>
               <a:graphicFrameLocks xmlns:a="http://schemas.openxmlformats.org/drawingml/2006/main" noChangeAspect="1"/>
             </wp:cNvGraphicFramePr>
@@ -22749,7 +22749,7 @@
               <a:graphicData uri="http://schemas.openxmlformats.org/drawingml/2006/picture">
                 <pic:pic xmlns:pic="http://schemas.openxmlformats.org/drawingml/2006/picture">
                   <pic:nvPicPr>
-                    <pic:cNvPr id="0" name="Picture 6"/>
+                    <pic:cNvPr id="0" name="Picture 4"/>
                     <pic:cNvPicPr>
                       <a:picLocks noChangeAspect="1" noChangeArrowheads="1"/>
                     </pic:cNvPicPr>
@@ -22770,7 +22770,7 @@
                   <pic:spPr bwMode="auto">
                     <a:xfrm>
                       <a:off x="0" y="0"/>
-                      <a:ext cx="6613200" cy="4006800"/>
+                      <a:ext cx="6696000" cy="4053600"/>
                     </a:xfrm>
                     <a:prstGeom prst="rect">
                       <a:avLst/>
@@ -31959,18 +31959,18 @@
         </w:rPr>
         <w:lastRenderedPageBreak/>
         <w:drawing>
-          <wp:anchor distT="0" distB="360045" distL="180340" distR="114300" simplePos="0" relativeHeight="251728896" behindDoc="0" locked="0" layoutInCell="1" allowOverlap="1" wp14:anchorId="103E3BC6" wp14:editId="5EE2DF26">
+          <wp:anchor distT="0" distB="0" distL="180340" distR="114300" simplePos="0" relativeHeight="251737088" behindDoc="0" locked="0" layoutInCell="1" allowOverlap="1" wp14:anchorId="650AB7B1" wp14:editId="33ADE70E">
             <wp:simplePos x="0" y="0"/>
             <wp:positionH relativeFrom="column">
-              <wp:posOffset>3002915</wp:posOffset>
+              <wp:align>right</wp:align>
             </wp:positionH>
             <wp:positionV relativeFrom="paragraph">
-              <wp:posOffset>162</wp:posOffset>
+              <wp:posOffset>0</wp:posOffset>
             </wp:positionV>
-            <wp:extent cx="3693600" cy="4964400"/>
-            <wp:effectExtent l="0" t="0" r="2540" b="8255"/>
+            <wp:extent cx="3697200" cy="4964400"/>
+            <wp:effectExtent l="0" t="0" r="0" b="8255"/>
             <wp:wrapSquare wrapText="bothSides"/>
-            <wp:docPr id="2100479635" name="Picture 2"/>
+            <wp:docPr id="934201218" name="Picture 1"/>
             <wp:cNvGraphicFramePr>
               <a:graphicFrameLocks xmlns:a="http://schemas.openxmlformats.org/drawingml/2006/main" noChangeAspect="1"/>
             </wp:cNvGraphicFramePr>
@@ -31978,7 +31978,7 @@
               <a:graphicData uri="http://schemas.openxmlformats.org/drawingml/2006/picture">
                 <pic:pic xmlns:pic="http://schemas.openxmlformats.org/drawingml/2006/picture">
                   <pic:nvPicPr>
-                    <pic:cNvPr id="0" name="Picture 5"/>
+                    <pic:cNvPr id="0" name="Picture 3"/>
                     <pic:cNvPicPr>
                       <a:picLocks noChangeAspect="1" noChangeArrowheads="1"/>
                     </pic:cNvPicPr>
@@ -31999,7 +31999,7 @@
                   <pic:spPr bwMode="auto">
                     <a:xfrm>
                       <a:off x="0" y="0"/>
-                      <a:ext cx="3693600" cy="4964400"/>
+                      <a:ext cx="3697200" cy="4964400"/>
                     </a:xfrm>
                     <a:prstGeom prst="rect">
                       <a:avLst/>
@@ -33375,13 +33375,6 @@
           <w:bCs/>
         </w:rPr>
         <w:lastRenderedPageBreak/>
-        <w:br/>
-      </w:r>
-      <w:r>
-        <w:rPr>
-          <w:b/>
-          <w:bCs/>
-        </w:rPr>
         <w:t>Data Insertion</w:t>
       </w:r>
     </w:p>
@@ -34524,6 +34517,14 @@
         </w:rPr>
         <w:t>queries run by the tags defined in the template files.</w:t>
       </w:r>
+    </w:p>
+    <w:p>
+      <w:pPr>
+        <w:rPr>
+          <w:sz w:val="20"/>
+          <w:szCs w:val="20"/>
+        </w:rPr>
+      </w:pPr>
     </w:p>
     <w:p>
       <w:pPr>
@@ -35524,7 +35525,7 @@
             <v:shape id="_x0000_s1025" type="#_x0000_t75" style="position:absolute;left:0;text-align:left;margin-left:463.75pt;margin-top:.75pt;width:63.55pt;height:9.75pt;z-index:251659264;mso-position-horizontal-relative:text;mso-position-vertical-relative:text">
               <v:imagedata r:id="rId2" o:title=""/>
             </v:shape>
-            <o:OLEObject Type="Embed" ProgID="PBrush" ShapeID="_x0000_s1025" DrawAspect="Content" ObjectID="_1842189003" r:id="rId3"/>
+            <o:OLEObject Type="Embed" ProgID="PBrush" ShapeID="_x0000_s1025" DrawAspect="Content" ObjectID="_1842421549" r:id="rId3"/>
           </w:object>
         </w:r>
         <w:r>
@@ -35618,7 +35619,7 @@
         <v:path o:extrusionok="f" gradientshapeok="t" o:connecttype="rect"/>
         <o:lock v:ext="edit" aspectratio="t"/>
       </v:shapetype>
-      <v:shape id="_x0000_i1035" type="#_x0000_t75" style="width:7.5pt;height:7.5pt;visibility:visible;mso-wrap-style:square" o:bullet="t">
+      <v:shape id="_x0000_i1030" type="#_x0000_t75" style="width:7.5pt;height:7.5pt;visibility:visible;mso-wrap-style:square" o:bullet="t">
         <v:imagedata r:id="rId1" o:title=""/>
       </v:shape>
     </w:pict>

</xml_diff>

<commit_message>
Added formula support to data insertion when reporting to templates
</commit_message>
<xml_diff>
--- a/BridgeOpsClient/Documentation/Bridge Manager User Guide.docx
+++ b/BridgeOpsClient/Documentation/Bridge Manager User Guide.docx
@@ -33390,7 +33390,49 @@
           <w:sz w:val="20"/>
           <w:szCs w:val="20"/>
         </w:rPr>
-        <w:t>In both Word tables and Excel sheets, additional rows are inserted below the tag to the height of the dataset. The dataset then replaces the tag and the area to its right and down. All existing cell formatting is replicated in the new rows.</w:t>
+        <w:t xml:space="preserve">In both Word tables and Excel sheets, additional rows are inserted below the tag to the height of the dataset. The dataset then replaces the tag and the area to its right and down. All existing cell formatting is replicated </w:t>
+      </w:r>
+      <w:r>
+        <w:rPr>
+          <w:sz w:val="20"/>
+          <w:szCs w:val="20"/>
+        </w:rPr>
+        <w:t>to</w:t>
+      </w:r>
+      <w:r>
+        <w:rPr>
+          <w:sz w:val="20"/>
+          <w:szCs w:val="20"/>
+        </w:rPr>
+        <w:t xml:space="preserve"> the new rows</w:t>
+      </w:r>
+      <w:r>
+        <w:rPr>
+          <w:sz w:val="20"/>
+          <w:szCs w:val="20"/>
+        </w:rPr>
+        <w:t xml:space="preserve">, </w:t>
+      </w:r>
+      <w:r>
+        <w:rPr>
+          <w:sz w:val="20"/>
+          <w:szCs w:val="20"/>
+        </w:rPr>
+        <w:t>as well as formulae</w:t>
+      </w:r>
+      <w:r>
+        <w:rPr>
+          <w:sz w:val="20"/>
+          <w:szCs w:val="20"/>
+        </w:rPr>
+        <w:t>, with updated addresses for reference cells and ranges</w:t>
+      </w:r>
+      <w:r>
+        <w:rPr>
+          <w:sz w:val="20"/>
+          <w:szCs w:val="20"/>
+        </w:rPr>
+        <w:t>.</w:t>
       </w:r>
       <w:r>
         <w:rPr>
@@ -35525,7 +35567,7 @@
             <v:shape id="_x0000_s1025" type="#_x0000_t75" style="position:absolute;left:0;text-align:left;margin-left:463.75pt;margin-top:.75pt;width:63.55pt;height:9.75pt;z-index:251659264;mso-position-horizontal-relative:text;mso-position-vertical-relative:text">
               <v:imagedata r:id="rId2" o:title=""/>
             </v:shape>
-            <o:OLEObject Type="Embed" ProgID="PBrush" ShapeID="_x0000_s1025" DrawAspect="Content" ObjectID="_1842421549" r:id="rId3"/>
+            <o:OLEObject Type="Embed" ProgID="PBrush" ShapeID="_x0000_s1025" DrawAspect="Content" ObjectID="_1843398177" r:id="rId3"/>
           </w:object>
         </w:r>
         <w:r>
@@ -35619,7 +35661,7 @@
         <v:path o:extrusionok="f" gradientshapeok="t" o:connecttype="rect"/>
         <o:lock v:ext="edit" aspectratio="t"/>
       </v:shapetype>
-      <v:shape id="_x0000_i1030" type="#_x0000_t75" style="width:7.5pt;height:7.5pt;visibility:visible;mso-wrap-style:square" o:bullet="t">
+      <v:shape id="_x0000_i1032" type="#_x0000_t75" style="width:7.5pt;height:7.5pt;visibility:visible;mso-wrap-style:square" o:bullet="t">
         <v:imagedata r:id="rId1" o:title=""/>
       </v:shape>
     </w:pict>

</xml_diff>